<commit_message>
Update milestone report with Kaggle results and verified system images
</commit_message>
<xml_diff>
--- a/documents/milestones/StudentInsight_Demo_Guide.docx
+++ b/documents/milestones/StudentInsight_Demo_Guide.docx
@@ -56,7 +56,7 @@
         <w:pStyle w:val="ListBullet"/>
       </w:pPr>
       <w:r>
-        <w:t>Start Streamlit using .venv on port 8502 and sign in with an authorized demonstration account. Do not reveal passwords or replace the real owner.</w:t>
+        <w:t>Start Streamlit using .venv on port 8502 and sign in with an authorized demonstration account. Use a demonstration account and keep passwords out of captures.</w:t>
       </w:r>
     </w:p>
     <w:p>
@@ -80,7 +80,7 @@
         <w:pStyle w:val="ListBullet"/>
       </w:pPr>
       <w:r>
-        <w:t>Check the current public model: G2 12 should give forecast 12 and interval 11 to 13. Blank optional G1 should show unavailable progress.</w:t>
+        <w:t>Use Kaggle academic performance by default. Explain Low, Middle and High bands, the nine inputs and the separate UCI grade reference.</w:t>
       </w:r>
     </w:p>
     <w:tbl>
@@ -293,7 +293,7 @@
                 <w:color w:val="000000"/>
                 <w:sz w:val="18"/>
               </w:rPr>
-              <w:t>After-period-two estimates for staff review</w:t>
+              <w:t>Retrospective performance bands for staff review</w:t>
             </w:r>
           </w:p>
         </w:tc>
@@ -394,7 +394,7 @@
                 <w:color w:val="000000"/>
                 <w:sz w:val="18"/>
               </w:rPr>
-              <w:t>Subject schemas and distinct partitions</w:t>
+              <w:t>Kaggle source, nine inputs and grouped split</w:t>
             </w:r>
           </w:p>
         </w:tc>
@@ -495,7 +495,7 @@
                 <w:color w:val="000000"/>
                 <w:sz w:val="18"/>
               </w:rPr>
-              <w:t>G2 wins validation for both subjects</w:t>
+              <w:t>Logistic regression wins grouped validation</w:t>
             </w:r>
           </w:p>
         </w:tc>
@@ -596,7 +596,7 @@
                 <w:color w:val="000000"/>
                 <w:sz w:val="18"/>
               </w:rPr>
-              <w:t>G2 12, forecast 12, interval 11 to 13</w:t>
+              <w:t>Name, observed activity and predicted band</w:t>
             </w:r>
           </w:p>
         </w:tc>
@@ -798,7 +798,7 @@
                 <w:color w:val="000000"/>
                 <w:sz w:val="18"/>
               </w:rPr>
-              <w:t>Errors, coverage and alert definitions</w:t>
+              <w:t>Accuracy, macro F1 and confusion matrix</w:t>
             </w:r>
           </w:p>
         </w:tc>
@@ -867,7 +867,7 @@
                 <w:color w:val="000000"/>
                 <w:sz w:val="18"/>
               </w:rPr>
-              <w:t>Notebook and Drive</w:t>
+              <w:t>GitHub, notebook and Drive</w:t>
             </w:r>
           </w:p>
         </w:tc>
@@ -899,7 +899,7 @@
                 <w:color w:val="000000"/>
                 <w:sz w:val="18"/>
               </w:rPr>
-              <w:t>Shared code and verified report ZIP</w:t>
+              <w:t>Revision, shared code and report ZIP</w:t>
             </w:r>
           </w:p>
         </w:tc>
@@ -1000,7 +1000,7 @@
                 <w:color w:val="000000"/>
                 <w:sz w:val="18"/>
               </w:rPr>
-              <w:t>56 tests, limitations and future data</w:t>
+              <w:t>92 tests, limitations and future data</w:t>
             </w:r>
           </w:p>
         </w:tc>
@@ -1137,7 +1137,7 @@
                 <w:color w:val="000000"/>
                 <w:sz w:val="18"/>
               </w:rPr>
-              <w:t>Choose Mathematics</w:t>
+              <w:t>Sign in</w:t>
             </w:r>
           </w:p>
         </w:tc>
@@ -1169,7 +1169,7 @@
                 <w:color w:val="000000"/>
                 <w:sz w:val="18"/>
               </w:rPr>
-              <w:t>G2 required and baseline label visible</w:t>
+              <w:t>Kaggle workspace is the default</w:t>
             </w:r>
           </w:p>
         </w:tc>
@@ -1206,7 +1206,7 @@
                 <w:color w:val="000000"/>
                 <w:sz w:val="18"/>
               </w:rPr>
-              <w:t>Leave G1 blank</w:t>
+              <w:t>Choose Sign up</w:t>
             </w:r>
           </w:p>
         </w:tc>
@@ -1238,7 +1238,7 @@
                 <w:color w:val="000000"/>
                 <w:sz w:val="18"/>
               </w:rPr>
-              <w:t>Recorded progress is unavailable</w:t>
+              <w:t>Additional staff registration remains available</w:t>
             </w:r>
           </w:p>
         </w:tc>
@@ -1275,7 +1275,7 @@
                 <w:color w:val="000000"/>
                 <w:sz w:val="18"/>
               </w:rPr>
-              <w:t>Enter G2 12</w:t>
+              <w:t>Inspect subjects</w:t>
             </w:r>
           </w:p>
         </w:tc>
@@ -1307,7 +1307,7 @@
                 <w:color w:val="000000"/>
                 <w:sz w:val="18"/>
               </w:rPr>
-              <w:t>Forecast 12 and interval 11 to 13</w:t>
+              <w:t>Twelve source-supported Kaggle topics</w:t>
             </w:r>
           </w:p>
         </w:tc>
@@ -1344,7 +1344,7 @@
                 <w:color w:val="000000"/>
                 <w:sz w:val="18"/>
               </w:rPr>
-              <w:t>Reference grade 10</w:t>
+              <w:t>Predict an individual</w:t>
             </w:r>
           </w:p>
         </w:tc>
@@ -1376,7 +1376,7 @@
                 <w:color w:val="000000"/>
                 <w:sz w:val="18"/>
               </w:rPr>
-              <w:t>Forecast 12 is at or above reference</w:t>
+              <w:t>Low, Middle or High band; no invented exact mark</w:t>
             </w:r>
           </w:p>
         </w:tc>
@@ -1413,7 +1413,7 @@
                 <w:color w:val="000000"/>
                 <w:sz w:val="18"/>
               </w:rPr>
-              <w:t>Historical Mathematics class</w:t>
+              <w:t>Historical class view</w:t>
             </w:r>
           </w:p>
         </w:tc>
@@ -1445,7 +1445,7 @@
                 <w:color w:val="000000"/>
                 <w:sz w:val="18"/>
               </w:rPr>
-              <w:t>79 test records before filters</w:t>
+              <w:t>96 test records before filters</w:t>
             </w:r>
           </w:p>
         </w:tc>
@@ -1482,7 +1482,7 @@
                 <w:color w:val="000000"/>
                 <w:sz w:val="18"/>
               </w:rPr>
-              <w:t>Switch to Portuguese</w:t>
+              <w:t>Search name or ID</w:t>
             </w:r>
           </w:p>
         </w:tc>
@@ -1514,7 +1514,7 @@
                 <w:color w:val="000000"/>
                 <w:sz w:val="18"/>
               </w:rPr>
-              <w:t>Separate model and 130 test records</w:t>
+              <w:t>Filtered review table and matching CSV</w:t>
             </w:r>
           </w:p>
         </w:tc>
@@ -1551,7 +1551,7 @@
                 <w:color w:val="000000"/>
                 <w:sz w:val="18"/>
               </w:rPr>
-              <w:t>Select a subject without history</w:t>
+              <w:t>Select UCI grade reference</w:t>
             </w:r>
           </w:p>
         </w:tc>
@@ -1583,7 +1583,7 @@
                 <w:color w:val="000000"/>
                 <w:sz w:val="18"/>
               </w:rPr>
-              <w:t>Training records required before prediction</w:t>
+              <w:t>Separate Mathematics and Portuguese grade models</w:t>
             </w:r>
           </w:p>
         </w:tc>
@@ -1620,7 +1620,7 @@
                 <w:color w:val="000000"/>
                 <w:sz w:val="18"/>
               </w:rPr>
-              <w:t>Inspect exported CSV</w:t>
+              <w:t>Run notebook</w:t>
             </w:r>
           </w:p>
         </w:tc>
@@ -1652,7 +1652,7 @@
                 <w:color w:val="000000"/>
                 <w:sz w:val="18"/>
               </w:rPr>
-              <w:t>Displayed predictions and bundle identity match</w:t>
+              <w:t>Kaggle training, charts and exports, plus UCI reference</w:t>
             </w:r>
           </w:p>
         </w:tc>
@@ -1689,7 +1689,7 @@
                 <w:color w:val="000000"/>
                 <w:sz w:val="18"/>
               </w:rPr>
-              <w:t>Copy same Drive ZIP twice</w:t>
+              <w:t>Inspect Git revision</w:t>
             </w:r>
           </w:p>
         </w:tc>
@@ -1721,7 +1721,7 @@
                 <w:color w:val="000000"/>
                 <w:sz w:val="18"/>
               </w:rPr>
-              <w:t>Existing report is not overwritten</w:t>
+              <w:t>Traceable application and experiment version</w:t>
             </w:r>
           </w:p>
         </w:tc>
@@ -1742,7 +1742,12 @@
     </w:p>
     <w:p>
       <w:r>
-        <w:t>Why select a baseline? It has the lowest validation MAE under the same folds. Why require G2? The current task predicts after period two. Does 80% mean a passing probability? No, it is a nominal interval coverage target under assumptions. Why not require every field? The selected predictor determines mandatory inputs, while expanded comparisons remain available. Can the university use it immediately? Local curriculum and later-cohort validation are still needed.</w:t>
+        <w:t>Why Kaggle xAPI? It has documented LMS origins, activity fields and twelve recorded topics. Why classify bands? Exact marks are absent. Why logistic regression? It has the highest grouped validation macro F1. Does 76% accuracy guarantee the next result? No. Are names predictors? No. Is it validated early warning? No, the source lacks cutoff dates and student identifiers. What does Drive save? Explicit project and report snapshots; sharing remains a separate permission.</w:t>
+      </w:r>
+    </w:p>
+    <w:p>
+      <w:r>
+        <w:t>The existing presentation is the earlier UCI edition. Revise it for the Kaggle results before delivering this demo. The current report and guide contain the new evidence.</w:t>
       </w:r>
     </w:p>
     <w:p>

</xml_diff>